<commit_message>
Potency Atlas: Потенција wording, rename annotations, per-strain rename correlation
Macedonian correction throughout all three deliverables (Потенца → Потенција;
Atlas, docx study, weekly report — both docx rebuilt, pp_verify PASS).

Atlas rename layer, joined from BCP_PRODUCT_MASTER_FINAL.xlsx sheet
01_Portfolio_Master (78 rows, 54 renamed, 36 distinct new names; snapshot
committed as portfolio_master.json):
- renamed batches marked on the potency band (gold-ringed dots, tooltip with
  old → new name) plus a per-value list under each band naming the old and
  new strain at that batch's test value;
- results tables gain a "Ново име | New name" column with STEADY/CAYN chips;
- new "Renames per strain" section: for every original strain, all master
  batches with their test values, how many distinct new names they were
  renamed into, and the THC bracket the Portfolio Master itself states.
</commit_message>
<xml_diff>
--- a/deliverables/potency_study/Strain_Potency_Study_14Aug2026.docx
+++ b/deliverables/potency_study/Strain_Potency_Study_14Aug2026.docx
@@ -59,7 +59,7 @@
           <w:spacing w:val="0"/>
           <w:kern w:val="0"/>
         </w:rPr>
-        <w:t>Студија на потенца по сорти</w:t>
+        <w:t>Студија на потенција по сорти</w:t>
       </w:r>
     </w:p>
     <w:p>
@@ -31102,7 +31102,7 @@
               <w:szCs w:val="28"/>
               <w:lang w:val="mk-MK"/>
             </w:rPr>
-            <w:t>СТУДИЈА НА ПОТЕНЦА ПО СОРТИ</w:t>
+            <w:t>СТУДИЈА НА ПОТЕНЦИЈА ПО СОРТИ</w:t>
           </w:r>
           <w:r>
             <w:rPr>

</xml_diff>

<commit_message>
Fix bare 10% to 10.00% in gap-note prose (house 2-decimal rule)
Independent adversarial verification workflow flagged two rendered
paragraphs (the per-strain tier legend in the Atlas and the matching
gap-disclosure sentence in the Word study) mixing "10.00%" with a bare
"10%" in the same sentence. Not a data error — every declared tier value
was already correctly 2-decimal everywhere — just prose polish to hold
the house numeric rule consistently in user-facing text.
</commit_message>
<xml_diff>
--- a/deliverables/potency_study/Strain_Potency_Study_14Aug2026.docx
+++ b/deliverables/potency_study/Strain_Potency_Study_14Aug2026.docx
@@ -7994,7 +7994,7 @@
           <w:spacing w:val="0"/>
           <w:kern w:val="0"/>
         </w:rPr>
-        <w:t>НЕМА КЛАСА | NO GRADE — Нема воспоставена класа 7.70%–10.80%: ниту еден тестиран резултат на оваа сорта не паѓа во оваа зона, и ниту еден цел број не може да ги премости соседните класи во рамки на 10%-ограничувањето — резултат тука би побарал индивидуална ОК проценка. | No established grade 7.70%–10.80%: no tested result of this strain falls in this zone, and no whole number can bridge the neighbouring tiers within the 10% cap — a result here would require individual QC assessment.</w:t>
+        <w:t>НЕМА КЛАСА | NO GRADE — Нема воспоставена класа 7.70%–10.80%: ниту еден тестиран резултат на оваа сорта не паѓа во оваа зона, и ниту еден цел број не може да ги премости соседните класи во рамки на 10,00%-ограничувањето — резултат тука би побарал индивидуална ОК проценка. | No established grade 7.70%–10.80%: no tested result of this strain falls in this zone, and no whole number can bridge the neighbouring tiers within the 10.00% cap — a result here would require individual QC assessment.</w:t>
       </w:r>
     </w:p>
     <w:p>
@@ -10906,7 +10906,7 @@
           <w:spacing w:val="0"/>
           <w:kern w:val="0"/>
         </w:rPr>
-        <w:t>НЕМА КЛАСА | NO GRADE — Нема воспоставена класа 9.66%–14.10%: ниту еден тестиран резултат на оваа сорта не паѓа во оваа зона, и ниту еден цел број не може да ги премости соседните класи во рамки на 10%-ограничувањето — резултат тука би побарал индивидуална ОК проценка. | No established grade 9.66%–14.10%: no tested result of this strain falls in this zone, and no whole number can bridge the neighbouring tiers within the 10% cap — a result here would require individual QC assessment.</w:t>
+        <w:t>НЕМА КЛАСА | NO GRADE — Нема воспоставена класа 9.66%–14.10%: ниту еден тестиран резултат на оваа сорта не паѓа во оваа зона, и ниту еден цел број не може да ги премости соседните класи во рамки на 10,00%-ограничувањето — резултат тука би побарал индивидуална ОК проценка. | No established grade 9.66%–14.10%: no tested result of this strain falls in this zone, and no whole number can bridge the neighbouring tiers within the 10.00% cap — a result here would require individual QC assessment.</w:t>
       </w:r>
     </w:p>
     <w:p>

</xml_diff>